<commit_message>
SOP-03: update to 50-state service model (AsherMed written confirmation)
Replace served-states-list language with nationwide availability while keeping
the physician-licensed-for-patient-state and pharmacy-shipping-licensure gates.

Co-Authored-By: Claude Opus 4.8 <noreply@anthropic.com>
Claude-Session: https://claude.ai/code/session_01JDcbR5K1eUpakYzYyEtC2s
</commit_message>
<xml_diff>
--- a/docs/sops/SOP03_Prescription_Handling_Policy.docx
+++ b/docs/sops/SOP03_Prescription_Handling_Policy.docx
@@ -537,7 +537,7 @@
           <w:sz w:val="22"/>
           <w:szCs w:val="22"/>
         </w:rPr>
-        <w:t xml:space="preserve">Velacore Operations performs a non-clinical order confirmation: program/payment confirmed, state-of-residence eligibility re-verified against the current served-states list, and shipping details validated. This step cannot override, alter, or substitute for the physician's clinical judgment.</w:t>
+        <w:t xml:space="preserve">Velacore Operations performs a non-clinical order confirmation: program/payment confirmed, U.S. residency confirmed (services are available in all 50 states per AsherMed's written licensure confirmation), and shipping details validated. This step cannot override, alter, or substitute for the physician's clinical judgment.</w:t>
       </w:r>
     </w:p>
     <w:p>
@@ -692,7 +692,7 @@
           <w:sz w:val="22"/>
           <w:szCs w:val="22"/>
         </w:rPr>
-        <w:t xml:space="preserve">State gate: no order proceeds unless the patient's state of residence is on the current served-states list and the dispensing pharmacy is licensed to ship there.</w:t>
+        <w:t xml:space="preserve">State gate: services are available in all 50 US states per AsherMed's written confirmation of nationwide physician licensure. No order proceeds unless the prescription was issued by a physician licensed for the patient's state and the dispensing pharmacy is licensed to ship to that state.</w:t>
       </w:r>
     </w:p>
     <w:p>
@@ -799,7 +799,7 @@
           <w:sz w:val="22"/>
           <w:szCs w:val="22"/>
         </w:rPr>
-        <w:t xml:space="preserve">This policy is reviewed at least annually and whenever the physician network, pharmacy routing, served-states list, or applicable pharmacy/telehealth law changes.</w:t>
+        <w:t xml:space="preserve">This policy is reviewed at least annually and whenever the physician network, pharmacy routing, or applicable pharmacy/telehealth law changes.</w:t>
       </w:r>
     </w:p>
     <w:p>

</xml_diff>